<commit_message>
add SRS and SDA
</commit_message>
<xml_diff>
--- a/proj-docs/proj-feasibilty/Draftly Feasibility report v1.docx
+++ b/proj-docs/proj-feasibilty/Draftly Feasibility report v1.docx
@@ -118,6 +118,7 @@
     <w:p>
       <w:pPr>
         <w:pStyle w:val="Subtitle"/>
+        <w:spacing w:after="0" w:lineRule="auto"/>
         <w:rPr>
           <w:rFonts w:ascii="Lora" w:cs="Lora" w:eastAsia="Lora" w:hAnsi="Lora"/>
           <w:i w:val="1"/>
@@ -130,21 +131,21 @@
         <w:rPr>
           <w:rtl w:val="0"/>
         </w:rPr>
-        <w:t xml:space="preserve">Draftly </w:t>
-      </w:r>
-      <w:r>
-        <w:rPr>
-          <w:i w:val="0"/>
-          <w:iCs w:val="0"/>
-          <w:rtl w:val="0"/>
-        </w:rPr>
-        <w:t xml:space="preserve">|</w:t>
-      </w:r>
-      <w:r>
-        <w:rPr>
-          <w:rtl w:val="0"/>
-        </w:rPr>
-        <w:t xml:space="preserve"> A Lawyer-in-the-Loop Legal Workflow Platform for Sri Lankan Legal Practice</w:t>
+        <w:t xml:space="preserve">Draftly</w:t>
+      </w:r>
+      <w:r>
+        <w:rPr>
+          <w:b w:val="1"/>
+          <w:bCs w:val="1"/>
+          <w:rtl w:val="0"/>
+        </w:rPr>
+        <w:t xml:space="preserve"> - </w:t>
+      </w:r>
+      <w:r>
+        <w:rPr>
+          <w:rtl w:val="0"/>
+        </w:rPr>
+        <w:t xml:space="preserve">A Lawyer in the Loop Legal Workflow Platform for Sri Lankan Legal Practice</w:t>
       </w:r>
       <w:r>
         <w:rPr>
@@ -864,7 +865,7 @@
     </w:p>
     <w:sdt>
       <w:sdtPr>
-        <w:id w:val="-2010597447"/>
+        <w:id w:val="-948356448"/>
         <w:docPartObj>
           <w:docPartGallery w:val="Table of Contents"/>
           <w:docPartUnique w:val="1"/>

</xml_diff>